<commit_message>
Add Day Comparer, voicemail/missed KPI updates, docs refresh, and nav reorder
</commit_message>
<xml_diff>
--- a/docs/CALCULATIONS.docx
+++ b/docs/CALCULATIONS.docx
@@ -4444,6 +4444,89 @@
       </w:tr>
     </w:tbl>
     <w:p/>
+    <w:p/>
+    <w:p>
+      <w:pPr>
+        <w:pStyle w:val="Heading1"/>
+      </w:pPr>
+      <w:r>
+        <w:t>8. April 2026 KPI Updates</w:t>
+      </w:r>
+    </w:p>
+    <w:p>
+      <w:pPr>
+        <w:pStyle w:val="Heading2"/>
+      </w:pPr>
+      <w:r>
+        <w:t>8.1 Voicemail and Missed Call Metrics</w:t>
+      </w:r>
+    </w:p>
+    <w:p>
+      <w:pPr/>
+      <w:r>
+        <w:t>Voicemail Calls are queue entries that were not answered by an agent and match voicemail-routing signals such as voicemail app/disposition fields, voicemail metadata, last_arg containing 'voicemail', or FusionPBX voicemail feature-code routing where destination_number or caller_destination starts with *99.</w:t>
+      </w:r>
+    </w:p>
+    <w:p>
+      <w:pPr/>
+      <w:r>
+        <w:t>Missed Calls are defined as abandoned calls plus voicemail calls.</w:t>
+      </w:r>
+    </w:p>
+    <w:p>
+      <w:pPr/>
+      <w:r>
+        <w:t>Missed Percent is calculated as missed calls divided by offered queue entries.</w:t>
+      </w:r>
+    </w:p>
+    <w:p>
+      <w:pPr>
+        <w:pStyle w:val="Heading2"/>
+      </w:pPr>
+      <w:r>
+        <w:t>8.2 Abandon Rate Clarification</w:t>
+      </w:r>
+    </w:p>
+    <w:p>
+      <w:pPr/>
+      <w:r>
+        <w:t>Abandoned calls are unanswered queue entries that did not end in voicemail. Abandon Rate uses abandoned divided by offered, so voicemail calls are excluded from the abandon numerator.</w:t>
+      </w:r>
+    </w:p>
+    <w:p>
+      <w:pPr>
+        <w:pStyle w:val="Heading2"/>
+      </w:pPr>
+      <w:r>
+        <w:t>8.3 Answered Classification Clarification</w:t>
+      </w:r>
+    </w:p>
+    <w:p>
+      <w:pPr/>
+      <w:r>
+        <w:t>In standard queue mode, answer_epoch plus NORMAL_CLEARING can still count as answered when cc_queue_answered_epoch is missing. However, voicemail-routed legs are explicitly excluded from that fallback so voicemail entries are not misclassified as answered. In strict mode, only cc_queue_answered_epoch counts as answered.</w:t>
+      </w:r>
+    </w:p>
+    <w:p>
+      <w:pPr>
+        <w:pStyle w:val="Heading2"/>
+      </w:pPr>
+      <w:r>
+        <w:t>8.4 Executive Overview and Day Comparer</w:t>
+      </w:r>
+    </w:p>
+    <w:p>
+      <w:pPr/>
+      <w:r>
+        <w:t>Executive Overview now exposes Voicemail Calls, Missed Calls, and Missed Percent using the same queue-entry classification logic as queue performance. Day Comparer reads those Executive Overview metrics for each selected day.</w:t>
+      </w:r>
+    </w:p>
+    <w:p>
+      <w:pPr/>
+      <w:r>
+        <w:t>Day Comparer resolves each selected day against the currently selected timezone boundary, including UTC mode.</w:t>
+      </w:r>
+    </w:p>
     <w:sectPr>
       <w:pgSz w:w="12240" w:h="15840"/>
       <w:pgMar w:top="1440" w:right="1800" w:bottom="1440" w:left="1800" w:header="720" w:footer="720" w:gutter="0"/>

</xml_diff>